<commit_message>
7.14 new verson and YT link test
</commit_message>
<xml_diff>
--- a/transcripts/Energy Espresso/EEP - Transcript Files/EEP_PWR HR_Viotas.docx
+++ b/transcripts/Energy Espresso/EEP - Transcript Files/EEP_PWR HR_Viotas.docx
@@ -5197,8 +5197,8 @@
 </file>
 
 <file path=customXml/item1.xml><?xml version="1.0" encoding="utf-8"?>
-<ct:contentTypeSchema xmlns:ct="http://schemas.microsoft.com/office/2006/metadata/contentType" xmlns:ma="http://schemas.microsoft.com/office/2006/metadata/properties/metaAttributes" ct:_="" ma:_="" ma:contentTypeName="Document" ma:contentTypeID="0x0101009FA1A6C12D5787448B6C6587D08F2965" ma:contentTypeVersion="16" ma:contentTypeDescription="Create a new document." ma:contentTypeScope="" ma:versionID="f761e0c469cfbaff44f5778f0037afbe">
-  <xsd:schema xmlns:xsd="http://www.w3.org/2001/XMLSchema" xmlns:xs="http://www.w3.org/2001/XMLSchema" xmlns:p="http://schemas.microsoft.com/office/2006/metadata/properties" xmlns:ns2="3352e729-ef3a-4ad2-a915-07867a2cbda9" xmlns:ns3="afa60c69-e8fd-4ab1-8c56-0fe28cc4c33c" targetNamespace="http://schemas.microsoft.com/office/2006/metadata/properties" ma:root="true" ma:fieldsID="4112f99f01cfafd8b48e38df3bf566de" ns2:_="" ns3:_="">
+<ct:contentTypeSchema xmlns:ct="http://schemas.microsoft.com/office/2006/metadata/contentType" xmlns:ma="http://schemas.microsoft.com/office/2006/metadata/properties/metaAttributes" ct:_="" ma:_="" ma:contentTypeName="Document" ma:contentTypeID="0x0101009FA1A6C12D5787448B6C6587D08F2965" ma:contentTypeVersion="17" ma:contentTypeDescription="Create a new document." ma:contentTypeScope="" ma:versionID="f24f86ada7cafa22c6ab13bdb6555528">
+  <xsd:schema xmlns:xsd="http://www.w3.org/2001/XMLSchema" xmlns:xs="http://www.w3.org/2001/XMLSchema" xmlns:p="http://schemas.microsoft.com/office/2006/metadata/properties" xmlns:ns2="3352e729-ef3a-4ad2-a915-07867a2cbda9" xmlns:ns3="afa60c69-e8fd-4ab1-8c56-0fe28cc4c33c" targetNamespace="http://schemas.microsoft.com/office/2006/metadata/properties" ma:root="true" ma:fieldsID="7c8705d240f78acc5ebc3285b88b00f2" ns2:_="" ns3:_="">
     <xsd:import namespace="3352e729-ef3a-4ad2-a915-07867a2cbda9"/>
     <xsd:import namespace="afa60c69-e8fd-4ab1-8c56-0fe28cc4c33c"/>
     <xsd:element name="properties">
@@ -5222,6 +5222,7 @@
                 <xsd:element ref="ns3:MediaServiceLocation" minOccurs="0"/>
                 <xsd:element ref="ns3:Ready" minOccurs="0"/>
                 <xsd:element ref="ns3:MediaServiceSearchProperties" minOccurs="0"/>
+                <xsd:element ref="ns3:MediaServiceBillingMetadata" minOccurs="0"/>
               </xsd:all>
             </xsd:complexType>
           </xsd:element>
@@ -5333,6 +5334,11 @@
       </xsd:simpleType>
     </xsd:element>
     <xsd:element name="MediaServiceSearchProperties" ma:index="23" nillable="true" ma:displayName="MediaServiceSearchProperties" ma:hidden="true" ma:internalName="MediaServiceSearchProperties" ma:readOnly="true">
+      <xsd:simpleType>
+        <xsd:restriction base="dms:Note"/>
+      </xsd:simpleType>
+    </xsd:element>
+    <xsd:element name="MediaServiceBillingMetadata" ma:index="24" nillable="true" ma:displayName="MediaServiceBillingMetadata" ma:hidden="true" ma:internalName="MediaServiceBillingMetadata" ma:readOnly="true">
       <xsd:simpleType>
         <xsd:restriction base="dms:Note"/>
       </xsd:simpleType>
@@ -5459,7 +5465,7 @@
 </file>
 
 <file path=customXml/itemProps1.xml><?xml version="1.0" encoding="utf-8"?>
-<ds:datastoreItem xmlns:ds="http://schemas.openxmlformats.org/officeDocument/2006/customXml" ds:itemID="{4ACF5A35-CD56-443C-AFE6-93D39D3DE0EA}"/>
+<ds:datastoreItem xmlns:ds="http://schemas.openxmlformats.org/officeDocument/2006/customXml" ds:itemID="{DC9923E0-11B6-4F8C-A015-07BE6FF154C6}"/>
 </file>
 
 <file path=customXml/itemProps2.xml><?xml version="1.0" encoding="utf-8"?>

</xml_diff>